<commit_message>
feat(generador fase 3): notificaciones de adjudicacion y causa de no adjudicacion en total
</commit_message>
<xml_diff>
--- a/src/generador-documentos/templates/notificacion-adjudicado-template.docx
+++ b/src/generador-documentos/templates/notificacion-adjudicado-template.docx
@@ -5,46 +5,6 @@
     <w:p>
       <w:pPr>
         <w:shd w:fill="ffffff" w:val="clear"/>
-        <w:spacing w:after="0" w:before="220" w:line="342.85714285714283" w:lineRule="auto"/>
-        <w:jc w:val="center"/>
-        <w:rPr>
-          <w:color w:val="1a1c1e"/>
-          <w:sz w:val="24"/>
-          <w:szCs w:val="24"/>
-        </w:rPr>
-      </w:pPr>
-      <w:r>
-        <w:rPr>
-          <w:b w:val="1"/>
-          <w:bCs w:val="1"/>
-          <w:color w:val="1a1c1e"/>
-          <w:sz w:val="24"/>
-          <w:szCs w:val="24"/>
-          <w:rtl w:val="0"/>
-        </w:rPr>
-        <w:t xml:space="preserve">REPÚBLICA BOLIVARIANA DE VENEZUELA</w:t>
-        <w:br w:type="textWrapping"/>
-      </w:r>
-      <w:r>
-        <w:rPr>
-          <w:b w:val="1"/>
-          <w:bCs w:val="1"/>
-          <w:color w:val="1a1c1e"/>
-          <w:sz w:val="24"/>
-          <w:szCs w:val="24"/>
-          <w:rtl w:val="0"/>
-        </w:rPr>
-        <w:t xml:space="preserve">{nom_ente_contratante}</w:t>
-      </w:r>
-      <w:r>
-        <w:rPr>
-          <w:rtl w:val="0"/>
-        </w:rPr>
-      </w:r>
-    </w:p>
-    <w:p>
-      <w:pPr>
-        <w:shd w:fill="ffffff" w:val="clear"/>
         <w:spacing w:after="0" w:before="0" w:line="342.85714285714283" w:lineRule="auto"/>
         <w:jc w:val="center"/>
         <w:rPr>
@@ -57,14 +17,8 @@
       </w:pPr>
       <w:r>
         <w:rPr>
-          <w:b w:val="1"/>
-          <w:bCs w:val="1"/>
-          <w:color w:val="1a1c1e"/>
-          <w:sz w:val="24"/>
-          <w:szCs w:val="24"/>
-          <w:rtl w:val="0"/>
-        </w:rPr>
-        <w:t xml:space="preserve">COMISIÓN DE CONTRATACIONES PÚBLICAS</w:t>
+          <w:rtl w:val="0"/>
+        </w:rPr>
       </w:r>
     </w:p>
     <w:p>
@@ -189,7 +143,7 @@
         </w:rPr>
         <w:t xml:space="preserve">Señores:</w:t>
         <w:br w:type="textWrapping"/>
-        <w:t xml:space="preserve">{oferente_primera_opción_au_au}</w:t>
+        <w:t xml:space="preserve">{oferente_adjudicado_au_au}</w:t>
       </w:r>
       <w:r>
         <w:rPr>
@@ -220,7 +174,7 @@
           <w:szCs w:val="24"/>
           <w:rtl w:val="0"/>
         </w:rPr>
-        <w:t xml:space="preserve">{rif_proveedor_evaluado_au_au}</w:t>
+        <w:t xml:space="preserve">{rif_oferente_adjudicado_au_au}</w:t>
         <w:br w:type="textWrapping"/>
       </w:r>
       <w:r>
@@ -241,7 +195,7 @@
           <w:szCs w:val="24"/>
           <w:rtl w:val="0"/>
         </w:rPr>
-        <w:t xml:space="preserve">{correo_proveedor_evaluado_au_au}</w:t>
+        <w:t xml:space="preserve">{correo_oferente_adjudicado_au_au}</w:t>
       </w:r>
       <w:r>
         <w:rPr>
@@ -360,41 +314,19 @@
           <w:highlight w:val="white"/>
           <w:rtl w:val="0"/>
         </w:rPr>
-        <w:t xml:space="preserve">oportunidad de notificarles formalmente que, en el marco del procedimiento de la referencia, les ha sido otorgada la</w:t>
-      </w:r>
-      <w:r>
-        <w:rPr>
-          <w:color w:val="1a1c1e"/>
-          <w:sz w:val="24"/>
-          <w:szCs w:val="24"/>
-          <w:rtl w:val="0"/>
-        </w:rPr>
-        <w:t xml:space="preserve">  </w:t>
-      </w:r>
-      <w:r>
-        <w:rPr>
-          <w:b w:val="1"/>
-          <w:bCs w:val="1"/>
-          <w:color w:val="1a1c1e"/>
-          <w:sz w:val="24"/>
-          <w:szCs w:val="24"/>
-          <w:rtl w:val="0"/>
-        </w:rPr>
-        <w:t xml:space="preserve">Adjudicación </w:t>
-      </w:r>
-      <w:r>
-        <w:rPr>
-          <w:color w:val="1a1c1e"/>
-          <w:sz w:val="24"/>
-          <w:szCs w:val="24"/>
-          <w:rtl w:val="0"/>
-        </w:rPr>
-        <w:t xml:space="preserve">para la contratación del objeto: </w:t>
-      </w:r>
-      <w:r>
-        <w:rPr>
-          <w:b w:val="1"/>
-          <w:bCs w:val="1"/>
+        <w:t xml:space="preserve">oportunidad de notificarles formalmente la decisión recaída en el marco proceso de contratación bajo la modalidad de Concurso Abierto N° {cod_nomenclatura_proceso_au_au} referente a:</w:t>
+      </w:r>
+      <w:r>
+        <w:rPr>
+          <w:color w:val="1a1c1e"/>
+          <w:sz w:val="24"/>
+          <w:szCs w:val="24"/>
+          <w:rtl w:val="0"/>
+        </w:rPr>
+        <w:t xml:space="preserve"> </w:t>
+      </w:r>
+      <w:r>
+        <w:rPr>
           <w:color w:val="1a1c1e"/>
           <w:sz w:val="24"/>
           <w:szCs w:val="24"/>
@@ -450,187 +382,1483 @@
           <w:szCs w:val="24"/>
           <w:rtl w:val="0"/>
         </w:rPr>
-        <w:t xml:space="preserve">, dictado por la Máxima Autoridad de este organismo, el cual se anexa a la presente comunicación.</w:t>
-      </w:r>
-    </w:p>
-    <w:p>
-      <w:pPr>
-        <w:shd w:fill="ffffff" w:val="clear"/>
-        <w:spacing w:after="280" w:before="220" w:line="342.85714285714283" w:lineRule="auto"/>
-        <w:jc w:val="both"/>
-        <w:rPr>
-          <w:color w:val="1a1c1e"/>
-          <w:sz w:val="24"/>
-          <w:szCs w:val="24"/>
-        </w:rPr>
-      </w:pPr>
-      <w:r>
+        <w:t xml:space="preserve">, dictado por la Máxima Autoridad de este organismo, cuyo contenido resolutivo se transcribe a continuación:</w:t>
+      </w:r>
+    </w:p>
+    <w:p>
+      <w:pPr>
+        <w:spacing w:line="360" w:lineRule="auto"/>
+        <w:jc w:val="both"/>
+        <w:rPr>
+          <w:b w:val="1"/>
+          <w:bCs w:val="1"/>
+          <w:sz w:val="24"/>
+          <w:szCs w:val="24"/>
+        </w:rPr>
+      </w:pPr>
+      <w:r>
+        <w:rPr>
+          <w:sz w:val="24"/>
+          <w:szCs w:val="24"/>
+          <w:rtl w:val="0"/>
+        </w:rPr>
+        <w:t xml:space="preserve">{#recomendacion_adjudicacion_total_au_au}</w:t>
+      </w:r>
+      <w:r>
+        <w:rPr>
+          <w:b w:val="1"/>
+          <w:bCs w:val="1"/>
+          <w:sz w:val="24"/>
+          <w:szCs w:val="24"/>
+          <w:rtl w:val="0"/>
+        </w:rPr>
+        <w:t xml:space="preserve">PRIMERO: ADJUDICACIÓN TOTAL </w:t>
+      </w:r>
+      <w:r>
+        <w:rPr>
+          <w:sz w:val="24"/>
+          <w:szCs w:val="24"/>
+          <w:rtl w:val="0"/>
+        </w:rPr>
+        <w:t xml:space="preserve">del presente Concurso Abierto a la empresa </w:t>
+      </w:r>
+      <w:r>
+        <w:rPr>
+          <w:b w:val="1"/>
+          <w:bCs w:val="1"/>
+          <w:sz w:val="24"/>
+          <w:szCs w:val="24"/>
+          <w:rtl w:val="0"/>
+        </w:rPr>
+        <w:t xml:space="preserve">{nombre_proveedor_evaluado_au_au}, RIF {rif_proveedor_evaluado_au_au}, </w:t>
+      </w:r>
+      <w:r>
+        <w:rPr>
+          <w:sz w:val="24"/>
+          <w:szCs w:val="24"/>
+          <w:rtl w:val="0"/>
+        </w:rPr>
+        <w:t xml:space="preserve">al haber resultado seleccionada como la</w:t>
+      </w:r>
+      <w:r>
+        <w:rPr>
+          <w:b w:val="1"/>
+          <w:bCs w:val="1"/>
+          <w:sz w:val="24"/>
+          <w:szCs w:val="24"/>
+          <w:rtl w:val="0"/>
+        </w:rPr>
+        <w:t xml:space="preserve"> Primera Opción </w:t>
+      </w:r>
+      <w:r>
+        <w:rPr>
+          <w:sz w:val="24"/>
+          <w:szCs w:val="24"/>
+          <w:rtl w:val="0"/>
+        </w:rPr>
+        <w:t xml:space="preserve">para la ejecución íntegra del objeto de la contratación especificada en el pliego de condiciones, los cuales serán imputados a la(s) Partida(s) Presupuestaria(s)</w:t>
+      </w:r>
+      <w:r>
+        <w:rPr>
+          <w:b w:val="1"/>
+          <w:bCs w:val="1"/>
+          <w:sz w:val="24"/>
+          <w:szCs w:val="24"/>
+          <w:rtl w:val="0"/>
+        </w:rPr>
+        <w:t xml:space="preserve"> N° {partidas_adjudicadas_total_au_au}. </w:t>
+      </w:r>
+      <w:r>
+        <w:rPr>
+          <w:sz w:val="24"/>
+          <w:szCs w:val="24"/>
+          <w:rtl w:val="0"/>
+        </w:rPr>
+        <w:t xml:space="preserve">El monto total adjudicado asciende a</w:t>
+      </w:r>
+      <w:r>
+        <w:rPr>
+          <w:b w:val="1"/>
+          <w:bCs w:val="1"/>
+          <w:sz w:val="24"/>
+          <w:szCs w:val="24"/>
+          <w:rtl w:val="0"/>
+        </w:rPr>
+        <w:t xml:space="preserve"> {monto_adjudicado_total_au_au} Bs., sin incluir el Impuesto al Valor Agregado (IVA). </w:t>
+      </w:r>
+      <w:r>
+        <w:rPr>
+          <w:sz w:val="24"/>
+          <w:szCs w:val="24"/>
+          <w:rtl w:val="0"/>
+        </w:rPr>
+        <w:t xml:space="preserve">El plazo de ejecución / entrega será de:</w:t>
+      </w:r>
+      <w:r>
+        <w:rPr>
+          <w:b w:val="1"/>
+          <w:bCs w:val="1"/>
+          <w:sz w:val="24"/>
+          <w:szCs w:val="24"/>
+          <w:rtl w:val="0"/>
+        </w:rPr>
+        <w:t xml:space="preserve"> {plazo_ejecucion_oferta_ganadora_au_au} </w:t>
+      </w:r>
+      <w:r>
+        <w:rPr>
+          <w:sz w:val="24"/>
+          <w:szCs w:val="24"/>
+          <w:rtl w:val="0"/>
+        </w:rPr>
+        <w:t xml:space="preserve">días hábiles.</w:t>
+      </w:r>
+      <w:r>
+        <w:rPr>
+          <w:rtl w:val="0"/>
+        </w:rPr>
+      </w:r>
+    </w:p>
+    <w:p>
+      <w:pPr>
+        <w:spacing w:line="360" w:lineRule="auto"/>
+        <w:jc w:val="both"/>
+        <w:rPr>
+          <w:sz w:val="24"/>
+          <w:szCs w:val="24"/>
+        </w:rPr>
+      </w:pPr>
+      <w:r>
+        <w:rPr>
+          <w:b w:val="1"/>
+          <w:bCs w:val="1"/>
+          <w:sz w:val="24"/>
+          <w:szCs w:val="24"/>
+          <w:rtl w:val="0"/>
+        </w:rPr>
+        <w:t xml:space="preserve">SEGUNDO: ADVERTIR LAS CONDICIONES DE FORMALIZACIÓN Y DECAIMIENTO:</w:t>
+      </w:r>
+      <w:r>
+        <w:rPr>
+          <w:sz w:val="24"/>
+          <w:szCs w:val="24"/>
+          <w:rtl w:val="0"/>
+        </w:rPr>
+        <w:t xml:space="preserve"> Se notifica al beneficiario de la Primera Opción que, de conformidad con los Artículos</w:t>
+      </w:r>
+      <w:r>
+        <w:rPr>
+          <w:b w:val="1"/>
+          <w:bCs w:val="1"/>
+          <w:sz w:val="24"/>
+          <w:szCs w:val="24"/>
+          <w:rtl w:val="0"/>
+        </w:rPr>
+        <w:t xml:space="preserve"> 127 del Reglamento de la LCP</w:t>
+      </w:r>
+      <w:r>
+        <w:rPr>
+          <w:sz w:val="24"/>
+          <w:szCs w:val="24"/>
+          <w:rtl w:val="0"/>
+        </w:rPr>
+        <w:t xml:space="preserve"> y </w:t>
+      </w:r>
+      <w:r>
+        <w:rPr>
+          <w:b w:val="1"/>
+          <w:bCs w:val="1"/>
+          <w:sz w:val="24"/>
+          <w:szCs w:val="24"/>
+          <w:rtl w:val="0"/>
+        </w:rPr>
+        <w:t xml:space="preserve">117 de la LCP</w:t>
+      </w:r>
+      <w:r>
+        <w:rPr>
+          <w:sz w:val="24"/>
+          <w:szCs w:val="24"/>
+          <w:rtl w:val="0"/>
+        </w:rPr>
+        <w:t xml:space="preserve">, dispone de los siguientes lapsos perentorios:</w:t>
+      </w:r>
+    </w:p>
+    <w:p>
+      <w:pPr>
+        <w:spacing w:line="360" w:lineRule="auto"/>
+        <w:jc w:val="both"/>
+        <w:rPr>
+          <w:sz w:val="24"/>
+          <w:szCs w:val="24"/>
+        </w:rPr>
+      </w:pPr>
+      <w:r>
+        <w:rPr>
+          <w:sz w:val="24"/>
+          <w:szCs w:val="24"/>
+          <w:rtl w:val="0"/>
+        </w:rPr>
+        <w:t xml:space="preserve">-Cinco (05) días hábiles para la consignación de las Garantías Contractuales.</w:t>
+      </w:r>
+    </w:p>
+    <w:p>
+      <w:pPr>
+        <w:spacing w:line="360" w:lineRule="auto"/>
+        <w:jc w:val="both"/>
+        <w:rPr>
+          <w:b w:val="1"/>
+          <w:bCs w:val="1"/>
+          <w:sz w:val="24"/>
+          <w:szCs w:val="24"/>
+        </w:rPr>
+      </w:pPr>
+      <w:r>
+        <w:rPr>
+          <w:sz w:val="24"/>
+          <w:szCs w:val="24"/>
+          <w:rtl w:val="0"/>
+        </w:rPr>
+        <w:t xml:space="preserve">-Ocho (08) días hábiles para la formalización de la firma del contrato, contados a partir de la presente notificación. El incumplimiento de cualquiera de los plazos señalados producirá de pleno derecho el </w:t>
+      </w:r>
+      <w:r>
+        <w:rPr>
+          <w:b w:val="1"/>
+          <w:bCs w:val="1"/>
+          <w:sz w:val="24"/>
+          <w:szCs w:val="24"/>
+          <w:rtl w:val="0"/>
+        </w:rPr>
+        <w:t xml:space="preserve">DECAIMIENTO DE LA ADJUDICACIÓN.</w:t>
+      </w:r>
+    </w:p>
+    <w:p>
+      <w:pPr>
+        <w:spacing w:line="360" w:lineRule="auto"/>
+        <w:jc w:val="both"/>
+        <w:rPr>
+          <w:sz w:val="24"/>
+          <w:szCs w:val="24"/>
+        </w:rPr>
+      </w:pPr>
+      <w:r>
+        <w:rPr>
+          <w:sz w:val="24"/>
+          <w:szCs w:val="24"/>
+          <w:rtl w:val="0"/>
+        </w:rPr>
+        <w:t xml:space="preserve">{#opcion_varias_ofertas_au_au}</w:t>
+      </w:r>
+      <w:r>
+        <w:rPr>
+          <w:b w:val="1"/>
+          <w:bCs w:val="1"/>
+          <w:sz w:val="24"/>
+          <w:szCs w:val="24"/>
+          <w:rtl w:val="0"/>
+        </w:rPr>
+        <w:t xml:space="preserve">TERCERO: ESTABLECER EL ORDEN DE PRELACIÓN </w:t>
+      </w:r>
+      <w:r>
+        <w:rPr>
+          <w:sz w:val="24"/>
+          <w:szCs w:val="24"/>
+          <w:rtl w:val="0"/>
+        </w:rPr>
+        <w:t xml:space="preserve">de las ofertas evaluadas que resultaron técnica y económicamente válidas, las cuales fungirán como opciones de reserva para asegurar la formalización de la contratación ante un eventual decaimiento de la primera opción, de conformidad con lo previsto en el Artículo 110 de la Ley de Contrataciones Públicas, bajo la siguiente estructura:</w:t>
+      </w:r>
+    </w:p>
+    <w:p>
+      <w:pPr>
+        <w:spacing w:line="360" w:lineRule="auto"/>
+        <w:jc w:val="both"/>
+        <w:rPr>
+          <w:sz w:val="24"/>
+          <w:szCs w:val="24"/>
+        </w:rPr>
+      </w:pPr>
+      <w:r>
+        <w:rPr>
+          <w:sz w:val="24"/>
+          <w:szCs w:val="24"/>
+          <w:rtl w:val="0"/>
+        </w:rPr>
+        <w:t xml:space="preserve">- Segunda Opción: {nombre_proveedor_evaluado_au_au}, RIF {rif_proveedor_evaluado_au_au}.</w:t>
+      </w:r>
+    </w:p>
+    <w:p>
+      <w:pPr>
+        <w:spacing w:line="360" w:lineRule="auto"/>
+        <w:jc w:val="both"/>
+        <w:rPr>
+          <w:sz w:val="24"/>
+          <w:szCs w:val="24"/>
+        </w:rPr>
+      </w:pPr>
+      <w:r>
+        <w:rPr>
+          <w:sz w:val="24"/>
+          <w:szCs w:val="24"/>
+          <w:rtl w:val="0"/>
+        </w:rPr>
+        <w:t xml:space="preserve">{#oferente_tercera_opcion_au_au}- Tercera Opción: {nombre_proveedor_evaluado_au_au}, RIF {rif_proveedor_evaluado_au_au}.{/oferente_tercera_opcion_au_au}</w:t>
+      </w:r>
+    </w:p>
+    <w:p>
+      <w:pPr>
+        <w:spacing w:line="360" w:lineRule="auto"/>
+        <w:jc w:val="both"/>
+        <w:rPr>
+          <w:sz w:val="24"/>
+          <w:szCs w:val="24"/>
+        </w:rPr>
+      </w:pPr>
+      <w:r>
+        <w:rPr>
+          <w:b w:val="1"/>
+          <w:bCs w:val="1"/>
+          <w:sz w:val="24"/>
+          <w:szCs w:val="24"/>
+          <w:rtl w:val="0"/>
+        </w:rPr>
+        <w:t xml:space="preserve">CUARTO: POTESTAD DE ADJUDICACIÓN SUBSIGUIENTE:</w:t>
+      </w:r>
+      <w:r>
+        <w:rPr>
+          <w:sz w:val="24"/>
+          <w:szCs w:val="24"/>
+          <w:rtl w:val="0"/>
+        </w:rPr>
+        <w:t xml:space="preserve"> En caso de que el beneficiario de la Primera Opción no manifieste su aceptación, no suministre las garantías oportunamente o no formalice la firma del contrato dentro de los lapsos perentorios supra indicados, la Máxima Autoridad procederá a dictar el Acto de Decaimiento de la Adjudicación y adjudicará de manera inmediata a la Segunda Opción (o en su defecto a la Tercera si existe), sin necesidad de una nueva convocatoria de la Comisión de Contrataciones. Esta potestad se ejerce con el fin de salvaguardar el patrimonio público y garantizar la continuidad administrativa, en estricto cumplimiento de las Normas de Control Interno de la SUNAI (Art. 4 y 33 de la G.O. 43.158) {/opcion_varias_ofertas_au_au}</w:t>
+      </w:r>
+    </w:p>
+    <w:p>
+      <w:pPr>
+        <w:spacing w:line="360" w:lineRule="auto"/>
+        <w:jc w:val="both"/>
+        <w:rPr>
+          <w:sz w:val="24"/>
+          <w:szCs w:val="24"/>
+        </w:rPr>
+      </w:pPr>
+      <w:r>
+        <w:rPr>
+          <w:sz w:val="24"/>
+          <w:szCs w:val="24"/>
+          <w:rtl w:val="0"/>
+        </w:rPr>
+        <w:t xml:space="preserve">{/recomendacion_adjudicacion_total_au_au}</w:t>
+      </w:r>
+    </w:p>
+    <w:p>
+      <w:pPr>
+        <w:jc w:val="both"/>
+        <w:rPr>
+          <w:sz w:val="24"/>
+          <w:szCs w:val="24"/>
+        </w:rPr>
+      </w:pPr>
+      <w:r>
+        <w:rPr>
+          <w:sz w:val="24"/>
+          <w:szCs w:val="24"/>
+          <w:rtl w:val="0"/>
+        </w:rPr>
+        <w:t xml:space="preserve">{#recomendacion_adjudicacion_parcial_au_au}</w:t>
+      </w:r>
+    </w:p>
+    <w:p>
+      <w:pPr>
+        <w:spacing w:line="360" w:lineRule="auto"/>
+        <w:jc w:val="both"/>
+        <w:rPr>
+          <w:sz w:val="24"/>
+          <w:szCs w:val="24"/>
+        </w:rPr>
+      </w:pPr>
+      <w:r>
+        <w:rPr>
+          <w:sz w:val="24"/>
+          <w:szCs w:val="24"/>
+          <w:rtl w:val="0"/>
+        </w:rPr>
+        <w:t xml:space="preserve">{#recomendacion_parcial_au_au}</w:t>
+      </w:r>
+    </w:p>
+    <w:p>
+      <w:pPr>
+        <w:spacing w:line="360" w:lineRule="auto"/>
+        <w:jc w:val="both"/>
+        <w:rPr>
+          <w:sz w:val="24"/>
+          <w:szCs w:val="24"/>
+        </w:rPr>
+      </w:pPr>
+      <w:r>
+        <w:rPr>
+          <w:b w:val="1"/>
+          <w:bCs w:val="1"/>
+          <w:sz w:val="24"/>
+          <w:szCs w:val="24"/>
+          <w:rtl w:val="0"/>
+        </w:rPr>
+        <w:t xml:space="preserve">{numeral_adjudicacion_au_au}: ADJUDICACIÓN PARCIAL </w:t>
+      </w:r>
+      <w:r>
+        <w:rPr>
+          <w:sz w:val="24"/>
+          <w:szCs w:val="24"/>
+          <w:rtl w:val="0"/>
+        </w:rPr>
+        <w:t xml:space="preserve">del presente Concurso Abierto a la empresa </w:t>
+      </w:r>
+      <w:r>
+        <w:rPr>
+          <w:b w:val="1"/>
+          <w:bCs w:val="1"/>
+          <w:sz w:val="24"/>
+          <w:szCs w:val="24"/>
+          <w:rtl w:val="0"/>
+        </w:rPr>
+        <w:t xml:space="preserve">{oferente_adjudicado_au_au},  RIF {rif_oferente_adjudicado_au_au}, </w:t>
+      </w:r>
+      <w:r>
+        <w:rPr>
+          <w:sz w:val="24"/>
+          <w:szCs w:val="24"/>
+          <w:rtl w:val="0"/>
+        </w:rPr>
+        <w:t xml:space="preserve">al haber resultado seleccionada como</w:t>
+      </w:r>
+      <w:r>
+        <w:rPr>
+          <w:b w:val="1"/>
+          <w:bCs w:val="1"/>
+          <w:sz w:val="24"/>
+          <w:szCs w:val="24"/>
+          <w:rtl w:val="0"/>
+        </w:rPr>
+        <w:t xml:space="preserve"> Primera Opción</w:t>
+      </w:r>
+      <w:r>
+        <w:rPr>
+          <w:sz w:val="24"/>
+          <w:szCs w:val="24"/>
+          <w:rtl w:val="0"/>
+        </w:rPr>
+        <w:t xml:space="preserve"> para la adjudicación de {cantidad_renglones_parcial_au_au} ítems, según el alcance técnico que se detalla a continuación</w:t>
+      </w:r>
+      <w:r>
+        <w:rPr>
+          <w:b w:val="1"/>
+          <w:bCs w:val="1"/>
+          <w:sz w:val="24"/>
+          <w:szCs w:val="24"/>
+          <w:rtl w:val="0"/>
+        </w:rPr>
+        <w:t xml:space="preserve">: {alcance_adjudicacion_parcial_au_au}, </w:t>
+      </w:r>
+      <w:r>
+        <w:rPr>
+          <w:sz w:val="24"/>
+          <w:szCs w:val="24"/>
+          <w:rtl w:val="0"/>
+        </w:rPr>
+        <w:t xml:space="preserve">los cuales serán imputados a la(s) Partida(s) Presupuestaria(s) </w:t>
+      </w:r>
+      <w:r>
+        <w:rPr>
+          <w:b w:val="1"/>
+          <w:bCs w:val="1"/>
+          <w:sz w:val="24"/>
+          <w:szCs w:val="24"/>
+          <w:rtl w:val="0"/>
+        </w:rPr>
+        <w:t xml:space="preserve">N° {partidas_adjudicadas_parcial_au_au}. </w:t>
+      </w:r>
+      <w:r>
+        <w:rPr>
+          <w:sz w:val="24"/>
+          <w:szCs w:val="24"/>
+          <w:rtl w:val="0"/>
+        </w:rPr>
+        <w:t xml:space="preserve">El monto total adjudicado asciende a</w:t>
+      </w:r>
+      <w:r>
+        <w:rPr>
+          <w:b w:val="1"/>
+          <w:bCs w:val="1"/>
+          <w:sz w:val="24"/>
+          <w:szCs w:val="24"/>
+          <w:rtl w:val="0"/>
+        </w:rPr>
+        <w:t xml:space="preserve"> {monto_adjudicado_parcial_au_au} Bs., </w:t>
+      </w:r>
+      <w:r>
+        <w:rPr>
+          <w:sz w:val="24"/>
+          <w:szCs w:val="24"/>
+          <w:rtl w:val="0"/>
+        </w:rPr>
+        <w:t xml:space="preserve">sin incluir el Impuesto al Valor Agregado (IVA). El plazo de ejecución / entrega será de: </w:t>
+      </w:r>
+      <w:r>
+        <w:rPr>
+          <w:b w:val="1"/>
+          <w:bCs w:val="1"/>
+          <w:sz w:val="24"/>
+          <w:szCs w:val="24"/>
+          <w:rtl w:val="0"/>
+        </w:rPr>
+        <w:t xml:space="preserve">{plazo_ejecucion_oferta_parcial_au_au} </w:t>
+      </w:r>
+      <w:r>
+        <w:rPr>
+          <w:sz w:val="24"/>
+          <w:szCs w:val="24"/>
+          <w:rtl w:val="0"/>
+        </w:rPr>
+        <w:t xml:space="preserve">días hábiles.{/recomendacion_parcial_au_au}</w:t>
+      </w:r>
+    </w:p>
+    <w:p>
+      <w:pPr>
+        <w:spacing w:line="360" w:lineRule="auto"/>
+        <w:jc w:val="both"/>
+        <w:rPr>
+          <w:sz w:val="24"/>
+          <w:szCs w:val="24"/>
+        </w:rPr>
+      </w:pPr>
+      <w:r>
+        <w:rPr>
+          <w:b w:val="1"/>
+          <w:bCs w:val="1"/>
+          <w:sz w:val="24"/>
+          <w:szCs w:val="24"/>
+          <w:rtl w:val="0"/>
+        </w:rPr>
+        <w:t xml:space="preserve">{numeral_advertencia_parcial_au_au}: ADVERTIR LAS CONDICIONES DE FORMALIZACIÓN Y DECAIMIENTO:</w:t>
+      </w:r>
+      <w:r>
+        <w:rPr>
+          <w:sz w:val="24"/>
+          <w:szCs w:val="24"/>
+          <w:rtl w:val="0"/>
+        </w:rPr>
+        <w:t xml:space="preserve"> Se notifica a los beneficiarios de la adjudicación que, conforme al </w:t>
+      </w:r>
+      <w:r>
+        <w:rPr>
+          <w:b w:val="1"/>
+          <w:bCs w:val="1"/>
+          <w:sz w:val="24"/>
+          <w:szCs w:val="24"/>
+          <w:rtl w:val="0"/>
+        </w:rPr>
+        <w:t xml:space="preserve">Artículo 127 del Reglamento de la LCP</w:t>
+      </w:r>
+      <w:r>
+        <w:rPr>
+          <w:sz w:val="24"/>
+          <w:szCs w:val="24"/>
+          <w:rtl w:val="0"/>
+        </w:rPr>
+        <w:t xml:space="preserve"> y al </w:t>
+      </w:r>
+      <w:r>
+        <w:rPr>
+          <w:b w:val="1"/>
+          <w:bCs w:val="1"/>
+          <w:sz w:val="24"/>
+          <w:szCs w:val="24"/>
+          <w:rtl w:val="0"/>
+        </w:rPr>
+        <w:t xml:space="preserve">Artículo 117 de la LCP</w:t>
+      </w:r>
+      <w:r>
+        <w:rPr>
+          <w:sz w:val="24"/>
+          <w:szCs w:val="24"/>
+          <w:rtl w:val="0"/>
+        </w:rPr>
+        <w:t xml:space="preserve">, disponen de los siguientes lapsos perentorios:</w:t>
+      </w:r>
+    </w:p>
+    <w:p>
+      <w:pPr>
+        <w:spacing w:line="360" w:lineRule="auto"/>
+        <w:jc w:val="both"/>
+        <w:rPr>
+          <w:sz w:val="24"/>
+          <w:szCs w:val="24"/>
+        </w:rPr>
+      </w:pPr>
+      <w:r>
+        <w:rPr>
+          <w:sz w:val="24"/>
+          <w:szCs w:val="24"/>
+          <w:rtl w:val="0"/>
+        </w:rPr>
+        <w:t xml:space="preserve">-Cinco (05) días hábiles para la consignación de las Garantías Contractuales.</w:t>
+      </w:r>
+    </w:p>
+    <w:p>
+      <w:pPr>
+        <w:spacing w:line="360" w:lineRule="auto"/>
+        <w:jc w:val="both"/>
+        <w:rPr>
+          <w:b w:val="1"/>
+          <w:bCs w:val="1"/>
+          <w:sz w:val="24"/>
+          <w:szCs w:val="24"/>
+        </w:rPr>
+      </w:pPr>
+      <w:r>
+        <w:rPr>
+          <w:sz w:val="24"/>
+          <w:szCs w:val="24"/>
+          <w:rtl w:val="0"/>
+        </w:rPr>
+        <w:t xml:space="preserve">-Ocho (08) días hábiles para la formalización de la firma del contrato, contados a partir de la notificación de la adjudicación.</w:t>
+      </w:r>
+      <w:r>
+        <w:rPr>
+          <w:rtl w:val="0"/>
+        </w:rPr>
+      </w:r>
+    </w:p>
+    <w:p>
+      <w:pPr>
+        <w:spacing w:line="360" w:lineRule="auto"/>
+        <w:jc w:val="both"/>
+        <w:rPr>
+          <w:sz w:val="24"/>
+          <w:szCs w:val="24"/>
+        </w:rPr>
+      </w:pPr>
+      <w:r>
+        <w:rPr>
+          <w:sz w:val="24"/>
+          <w:szCs w:val="24"/>
+          <w:rtl w:val="0"/>
+        </w:rPr>
+        <w:t xml:space="preserve">{#opcion_varias_ofertas_au_au}</w:t>
+      </w:r>
+      <w:r>
+        <w:rPr>
+          <w:b w:val="1"/>
+          <w:bCs w:val="1"/>
+          <w:sz w:val="24"/>
+          <w:szCs w:val="24"/>
+          <w:rtl w:val="0"/>
+        </w:rPr>
+        <w:t xml:space="preserve">{numeral_prelacion_parcial_au_au}: ESTABLECER EL ORDEN DE PRELACIÓN</w:t>
+      </w:r>
+      <w:r>
+        <w:rPr>
+          <w:sz w:val="24"/>
+          <w:szCs w:val="24"/>
+          <w:rtl w:val="0"/>
+        </w:rPr>
+        <w:t xml:space="preserve"> de las ofertas evaluadas que resultaron técnica y económicamente válidas, las cuales fungirán como opciones de reserva para asegurar la formalización de la contratación ante un eventual decaimiento de alguno de los beneficiarios de la adjudicación, de conformidad con lo previsto en el Artículo 110 de la Ley de Contrataciones Públicas, bajo la siguiente estructura:</w:t>
+      </w:r>
+    </w:p>
+    <w:p>
+      <w:pPr>
+        <w:spacing w:line="360" w:lineRule="auto"/>
+        <w:jc w:val="both"/>
+        <w:rPr>
+          <w:sz w:val="24"/>
+          <w:szCs w:val="24"/>
+        </w:rPr>
+      </w:pPr>
+      <w:r>
+        <w:rPr>
+          <w:sz w:val="24"/>
+          <w:szCs w:val="24"/>
+          <w:rtl w:val="0"/>
+        </w:rPr>
+        <w:t xml:space="preserve">- Segunda Opción: {nombre_segunda_opcion_au_au}, RIF {rif_segunda_opcion_au_au}.</w:t>
+      </w:r>
+    </w:p>
+    <w:p>
+      <w:pPr>
+        <w:spacing w:line="360" w:lineRule="auto"/>
+        <w:jc w:val="both"/>
+        <w:rPr>
+          <w:sz w:val="24"/>
+          <w:szCs w:val="24"/>
+        </w:rPr>
+      </w:pPr>
+      <w:r>
+        <w:rPr>
+          <w:sz w:val="24"/>
+          <w:szCs w:val="24"/>
+          <w:rtl w:val="0"/>
+        </w:rPr>
+        <w:t xml:space="preserve">{#oferente_tercera_opcion_au_au}- Tercera Opción: {nombre_tercera_opcion_au_au}, RIF {rif_tercera_opcion_au_au}.{/oferente_tercera_opcion_au_au}</w:t>
+      </w:r>
+    </w:p>
+    <w:p>
+      <w:pPr>
+        <w:spacing w:line="360" w:lineRule="auto"/>
+        <w:jc w:val="both"/>
+        <w:rPr>
+          <w:b w:val="1"/>
+          <w:bCs w:val="1"/>
+          <w:sz w:val="24"/>
+          <w:szCs w:val="24"/>
+        </w:rPr>
+      </w:pPr>
+      <w:r>
+        <w:rPr>
+          <w:b w:val="1"/>
+          <w:bCs w:val="1"/>
+          <w:sz w:val="24"/>
+          <w:szCs w:val="24"/>
+          <w:rtl w:val="0"/>
+        </w:rPr>
+        <w:t xml:space="preserve">{numeral_potestad_parcial_au_au}: POTESTAD DE ADJUDICACIÓN SUBSIGUIENTE:</w:t>
+      </w:r>
+      <w:r>
+        <w:rPr>
+          <w:sz w:val="24"/>
+          <w:szCs w:val="24"/>
+          <w:rtl w:val="0"/>
+        </w:rPr>
+        <w:t xml:space="preserve"> En caso de que alguno de los beneficiarios de la adjudicación no manifieste su aceptación, no suministre las garantías oportunamente o no formalice la firma del contrato dentro de los lapsos perentorios supra indicados, la Máxima Autoridad procederá a dictar el </w:t>
+      </w:r>
+      <w:r>
+        <w:rPr>
+          <w:b w:val="1"/>
+          <w:bCs w:val="1"/>
+          <w:sz w:val="24"/>
+          <w:szCs w:val="24"/>
+          <w:rtl w:val="0"/>
+        </w:rPr>
+        <w:t xml:space="preserve">Acto de Decaimiento de la Adjudicación</w:t>
+      </w:r>
+      <w:r>
+        <w:rPr>
+          <w:sz w:val="24"/>
+          <w:szCs w:val="24"/>
+          <w:rtl w:val="0"/>
+        </w:rPr>
+        <w:t xml:space="preserve"> y adjudicará de manera inmediata a la Segunda Opción (o en su defecto a la Tercera si existe), sin necesidad de una nueva convocatoria de la Comisión de Contrataciones. Esta potestad se ejerce con el fin de salvaguardar el patrimonio público y garantizar la continuidad administrativa, en estricto cumplimiento de las Normas de Control Interno de la SUNAI (Art. 4 y 33 de la G.O. 43.158). {/opcion_varias_ofertas_au_au}</w:t>
+      </w:r>
+      <w:r>
+        <w:rPr>
+          <w:rtl w:val="0"/>
+        </w:rPr>
+      </w:r>
+    </w:p>
+    <w:p>
+      <w:pPr>
+        <w:jc w:val="both"/>
+        <w:rPr>
+          <w:sz w:val="24"/>
+          <w:szCs w:val="24"/>
+        </w:rPr>
+      </w:pPr>
+      <w:r>
+        <w:rPr>
+          <w:sz w:val="24"/>
+          <w:szCs w:val="24"/>
+          <w:rtl w:val="0"/>
+        </w:rPr>
+        <w:t xml:space="preserve">{/recomendacion_adjudicacion_parcial_au_au}</w:t>
+      </w:r>
+    </w:p>
+    <w:p>
+      <w:pPr>
+        <w:jc w:val="both"/>
+        <w:rPr>
+          <w:sz w:val="24"/>
+          <w:szCs w:val="24"/>
+        </w:rPr>
+      </w:pPr>
+      <w:r>
+        <w:rPr>
+          <w:sz w:val="24"/>
+          <w:szCs w:val="24"/>
+          <w:rtl w:val="0"/>
+        </w:rPr>
+        <w:t xml:space="preserve">{#declaratoria_desierta_parcial_au_au}</w:t>
+      </w:r>
+    </w:p>
+    <w:p>
+      <w:pPr>
+        <w:spacing w:line="360" w:lineRule="auto"/>
+        <w:jc w:val="both"/>
+        <w:rPr>
+          <w:sz w:val="24"/>
+          <w:szCs w:val="24"/>
+        </w:rPr>
+      </w:pPr>
+      <w:r>
+        <w:rPr>
+          <w:b w:val="1"/>
+          <w:bCs w:val="1"/>
+          <w:sz w:val="24"/>
+          <w:szCs w:val="24"/>
+          <w:rtl w:val="0"/>
+        </w:rPr>
+        <w:t xml:space="preserve">{numeral_desierto_au_au}: DECLARAR DESIERTOS </w:t>
+      </w:r>
+      <w:r>
+        <w:rPr>
+          <w:sz w:val="24"/>
+          <w:szCs w:val="24"/>
+          <w:rtl w:val="0"/>
+        </w:rPr>
+        <w:t xml:space="preserve">los renglones correspondientes a los ítems</w:t>
+      </w:r>
+      <w:r>
+        <w:rPr>
+          <w:b w:val="1"/>
+          <w:bCs w:val="1"/>
+          <w:sz w:val="24"/>
+          <w:szCs w:val="24"/>
+          <w:rtl w:val="0"/>
+        </w:rPr>
+        <w:t xml:space="preserve"> {</w:t>
+      </w:r>
+      <w:r>
+        <w:rPr>
+          <w:b w:val="1"/>
+          <w:bCs w:val="1"/>
+          <w:sz w:val="24"/>
+          <w:szCs w:val="24"/>
+          <w:rtl w:val="0"/>
+        </w:rPr>
+        <w:t xml:space="preserve">items_sin_ofertas_au_au</w:t>
+      </w:r>
+      <w:r>
+        <w:rPr>
+          <w:b w:val="1"/>
+          <w:bCs w:val="1"/>
+          <w:sz w:val="24"/>
+          <w:szCs w:val="24"/>
+          <w:rtl w:val="0"/>
+        </w:rPr>
+        <w:t xml:space="preserve">}, </w:t>
+      </w:r>
+      <w:r>
+        <w:rPr>
+          <w:sz w:val="24"/>
+          <w:szCs w:val="24"/>
+          <w:rtl w:val="0"/>
+        </w:rPr>
+        <w:t xml:space="preserve">en virtud de la</w:t>
+      </w:r>
+      <w:r>
+        <w:rPr>
+          <w:b w:val="1"/>
+          <w:bCs w:val="1"/>
+          <w:sz w:val="24"/>
+          <w:szCs w:val="24"/>
+          <w:rtl w:val="0"/>
+        </w:rPr>
+        <w:t xml:space="preserve"> {motivo_items_sin_ofertas_au_au}, </w:t>
+      </w:r>
+      <w:r>
+        <w:rPr>
+          <w:sz w:val="24"/>
+          <w:szCs w:val="24"/>
+          <w:rtl w:val="0"/>
+        </w:rPr>
+        <w:t xml:space="preserve">habilitando a la Institución para proceder con su adquisición futura mediante la modalidad de contratación que resulte aplicable según el monto remanente. {/declaratoria_desierta_parcial_au_au}</w:t>
+      </w:r>
+    </w:p>
+    <w:p>
+      <w:pPr>
+        <w:shd w:fill="ffffff" w:val="clear"/>
+        <w:spacing w:line="360" w:lineRule="auto"/>
+        <w:jc w:val="both"/>
+        <w:rPr>
+          <w:color w:val="1a1c1e"/>
+          <w:sz w:val="24"/>
+          <w:szCs w:val="24"/>
+        </w:rPr>
+      </w:pPr>
+      <w:r>
+        <w:rPr>
+          <w:b w:val="1"/>
+          <w:bCs w:val="1"/>
+          <w:color w:val="1a1c1e"/>
+          <w:sz w:val="24"/>
+          <w:szCs w:val="24"/>
+          <w:rtl w:val="0"/>
+        </w:rPr>
+        <w:t xml:space="preserve">{numeral_crs_au_au}: RATIFICAR </w:t>
+      </w:r>
+      <w:r>
+        <w:rPr>
+          <w:color w:val="1a1c1e"/>
+          <w:sz w:val="24"/>
+          <w:szCs w:val="24"/>
+          <w:rtl w:val="0"/>
+        </w:rPr>
+        <w:t xml:space="preserve">el Compromiso de Responsabilidad Social asumido por la(s) empresa(s) adjudicataria(s), equivalente al {porcentaje_responsabilidad_social_au_au}% del monto total del contrato, sin incluir el Impuesto al Valor Agregado (I.V.A). Dicho compromiso deberá ser formalizado y ejecutado en los siguientes términos y condiciones establecidos {forma_responsabilidad_social_au_au}.</w:t>
+      </w:r>
+    </w:p>
+    <w:p>
+      <w:pPr>
+        <w:shd w:fill="ffffff" w:val="clear"/>
+        <w:spacing w:line="360" w:lineRule="auto"/>
+        <w:jc w:val="both"/>
+        <w:rPr>
+          <w:color w:val="1a1c1e"/>
+          <w:sz w:val="24"/>
+          <w:szCs w:val="24"/>
+        </w:rPr>
+      </w:pPr>
+      <w:r>
+        <w:rPr>
+          <w:color w:val="1a1c1e"/>
+          <w:sz w:val="24"/>
+          <w:szCs w:val="24"/>
+          <w:rtl w:val="0"/>
+        </w:rPr>
+        <w:t xml:space="preserve">{#garantia_cumplimiento_total_au_au}</w:t>
+      </w:r>
+      <w:r>
+        <w:rPr>
+          <w:b w:val="1"/>
+          <w:bCs w:val="1"/>
+          <w:color w:val="1a1c1e"/>
+          <w:sz w:val="24"/>
+          <w:szCs w:val="24"/>
+          <w:rtl w:val="0"/>
+        </w:rPr>
+        <w:t xml:space="preserve">{numeral_garantias_cumplimiento_au_au}: INSTRUIR </w:t>
+      </w:r>
+      <w:r>
+        <w:rPr>
+          <w:color w:val="1a1c1e"/>
+          <w:sz w:val="24"/>
+          <w:szCs w:val="24"/>
+          <w:rtl w:val="0"/>
+        </w:rPr>
+        <w:t xml:space="preserve">a la empresa adjudicada a constituir la Garantía de Fiel Cumplimiento equivalente al {porcentaje_fiel_cumplimiento_au_au}% del monto del contrato incluyendo tributos, </w:t>
+      </w:r>
+      <w:r>
+        <w:rPr>
+          <w:sz w:val="24"/>
+          <w:szCs w:val="24"/>
+          <w:rtl w:val="0"/>
+        </w:rPr>
+        <w:t xml:space="preserve">el cual es de {monto_fiel_cumplimiento_bs_letras_au_au} Bolívares (Bs. {monto_fiel_cumplimiento_bs_au_au}),</w:t>
+      </w:r>
+      <w:r>
+        <w:rPr>
+          <w:color w:val="1a1c1e"/>
+          <w:sz w:val="24"/>
+          <w:szCs w:val="24"/>
+          <w:rtl w:val="0"/>
+        </w:rPr>
+        <w:t xml:space="preserve"> de conformidad con los artículos 123 de la Ley de Contrataciones Públicas. Dispone de un plazo máximo de cinco (05) días hábiles, contados a partir de la notificación, para consignar dichas garantías ante la Oficina de Consultoría Jurídica.{/garantia_cumplimiento_total_au_au}</w:t>
+      </w:r>
+    </w:p>
+    <w:p>
+      <w:pPr>
+        <w:shd w:fill="ffffff" w:val="clear"/>
+        <w:spacing w:line="360" w:lineRule="auto"/>
+        <w:jc w:val="both"/>
+        <w:rPr>
+          <w:color w:val="1a1c1e"/>
+          <w:sz w:val="24"/>
+          <w:szCs w:val="24"/>
+        </w:rPr>
+      </w:pPr>
+      <w:r>
+        <w:rPr>
+          <w:color w:val="1a1c1e"/>
+          <w:sz w:val="24"/>
+          <w:szCs w:val="24"/>
+          <w:rtl w:val="0"/>
+        </w:rPr>
+        <w:t xml:space="preserve">{#garantia_cumplimiento_parcial_au_au}</w:t>
+      </w:r>
+      <w:r>
+        <w:rPr>
+          <w:b w:val="1"/>
+          <w:bCs w:val="1"/>
+          <w:color w:val="1a1c1e"/>
+          <w:sz w:val="24"/>
+          <w:szCs w:val="24"/>
+          <w:rtl w:val="0"/>
+        </w:rPr>
+        <w:t xml:space="preserve">{numeral_garantias_cumplimiento_au_au}: INSTRUIR </w:t>
+      </w:r>
+      <w:r>
+        <w:rPr>
+          <w:color w:val="1a1c1e"/>
+          <w:sz w:val="24"/>
+          <w:szCs w:val="24"/>
+          <w:rtl w:val="0"/>
+        </w:rPr>
+        <w:t xml:space="preserve">a las empresas adjudicadas a constituir la Garantía de Fiel Cumplimiento:</w:t>
+      </w:r>
+    </w:p>
+    <w:p>
+      <w:pPr>
+        <w:shd w:fill="ffffff" w:val="clear"/>
+        <w:spacing w:line="360" w:lineRule="auto"/>
+        <w:jc w:val="both"/>
+        <w:rPr>
+          <w:color w:val="1a1c1e"/>
+          <w:sz w:val="24"/>
+          <w:szCs w:val="24"/>
+        </w:rPr>
+      </w:pPr>
+      <w:r>
+        <w:rPr>
+          <w:color w:val="1a1c1e"/>
+          <w:sz w:val="24"/>
+          <w:szCs w:val="24"/>
+          <w:rtl w:val="0"/>
+        </w:rPr>
+        <w:t xml:space="preserve">{#monto_garantia_cumplimiento_parcial_au_au} - </w:t>
+      </w:r>
+      <w:r>
+        <w:rPr>
+          <w:b w:val="1"/>
+          <w:bCs w:val="1"/>
+          <w:sz w:val="24"/>
+          <w:szCs w:val="24"/>
+          <w:rtl w:val="0"/>
+        </w:rPr>
+        <w:t xml:space="preserve">{oferente_adjudicado_au_au},  RIF {rif_oferente_adjudicado_au_au}: </w:t>
+      </w:r>
+      <w:r>
+        <w:rPr>
+          <w:color w:val="1a1c1e"/>
+          <w:sz w:val="24"/>
+          <w:szCs w:val="24"/>
+          <w:rtl w:val="0"/>
+        </w:rPr>
+        <w:t xml:space="preserve">garantía equivalente al {porcentaje_fiel_cumplimiento_au_au}% del monto del contrato incluyendo tributos, </w:t>
+      </w:r>
+      <w:r>
+        <w:rPr>
+          <w:sz w:val="24"/>
+          <w:szCs w:val="24"/>
+          <w:rtl w:val="0"/>
+        </w:rPr>
+        <w:t xml:space="preserve">el cual es de {monto_fiel_cumplimiento_bs_letras} Bolívares (Bs. {monto_fiel_cumplimiento_bs_au_au}),</w:t>
+      </w:r>
+      <w:r>
+        <w:rPr>
+          <w:color w:val="1a1c1e"/>
+          <w:sz w:val="24"/>
+          <w:szCs w:val="24"/>
+          <w:rtl w:val="0"/>
+        </w:rPr>
+        <w:t xml:space="preserve"> de conformidad con los artículos 123 de la Ley de Contrataciones Públicas. Dispone de un plazo máximo de cinco (05) días hábiles, contados a partir de la notificación, para consignar dichas garantías ante la Oficina de Consultoría Jurídica. {/monto_garantia_cumplimiento_parcial_au_au}</w:t>
+      </w:r>
+    </w:p>
+    <w:p>
+      <w:pPr>
+        <w:shd w:fill="ffffff" w:val="clear"/>
+        <w:spacing w:line="360" w:lineRule="auto"/>
+        <w:jc w:val="both"/>
+        <w:rPr>
+          <w:color w:val="1a1c1e"/>
+          <w:sz w:val="24"/>
+          <w:szCs w:val="24"/>
+        </w:rPr>
+      </w:pPr>
+      <w:r>
+        <w:rPr>
+          <w:color w:val="1a1c1e"/>
+          <w:sz w:val="24"/>
+          <w:szCs w:val="24"/>
+          <w:rtl w:val="0"/>
+        </w:rPr>
+        <w:t xml:space="preserve">{/garantia_cumplimiento_parcial_au_au}</w:t>
+      </w:r>
+    </w:p>
+    <w:p>
+      <w:pPr>
+        <w:shd w:fill="ffffff" w:val="clear"/>
+        <w:spacing w:line="360" w:lineRule="auto"/>
+        <w:jc w:val="both"/>
+        <w:rPr>
+          <w:color w:val="1a1c1e"/>
+          <w:sz w:val="24"/>
+          <w:szCs w:val="24"/>
+        </w:rPr>
+      </w:pPr>
+      <w:r>
+        <w:rPr>
+          <w:color w:val="1a1c1e"/>
+          <w:sz w:val="24"/>
+          <w:szCs w:val="24"/>
+          <w:rtl w:val="0"/>
+        </w:rPr>
+        <w:t xml:space="preserve">{#retencion_fiel_cumplimiento_au_au}No obstante, en ejercicio de la facultad prevista en el artículo 123 de la referida Ley, la adjudicataria podrá autorizar al </w:t>
+      </w:r>
+      <w:r>
+        <w:rPr>
+          <w:sz w:val="24"/>
+          <w:szCs w:val="24"/>
+          <w:rtl w:val="0"/>
+        </w:rPr>
+        <w:t xml:space="preserve">{nom_ente_contratante}</w:t>
+      </w:r>
+      <w:r>
+        <w:rPr>
+          <w:color w:val="1a1c1e"/>
+          <w:sz w:val="24"/>
+          <w:szCs w:val="24"/>
+          <w:rtl w:val="0"/>
+        </w:rPr>
+        <w:t xml:space="preserve"> a efectuar la retención del diez por ciento (10%) sobre los pagos o valuaciones que se realicen, a fin de garantizar el cumplimiento integral de las obligaciones asumidas, cuyo monto acumulado será reintegrado al momento de la recepción definitiva del objeto contratado. {/retencion_fiel_cumplimiento_au_au}</w:t>
+      </w:r>
+    </w:p>
+    <w:p>
+      <w:pPr>
+        <w:shd w:fill="ffffff" w:val="clear"/>
+        <w:spacing w:line="360" w:lineRule="auto"/>
+        <w:jc w:val="both"/>
+        <w:rPr>
+          <w:color w:val="1a1c1e"/>
+          <w:sz w:val="24"/>
+          <w:szCs w:val="24"/>
+        </w:rPr>
+      </w:pPr>
+      <w:r>
+        <w:rPr>
+          <w:color w:val="1a1c1e"/>
+          <w:sz w:val="24"/>
+          <w:szCs w:val="24"/>
+          <w:rtl w:val="0"/>
+        </w:rPr>
+        <w:t xml:space="preserve">{#requiere_garantia_laboral_au_au} </w:t>
+      </w:r>
+    </w:p>
+    <w:p>
+      <w:pPr>
+        <w:shd w:fill="ffffff" w:val="clear"/>
+        <w:spacing w:line="360" w:lineRule="auto"/>
+        <w:jc w:val="both"/>
+        <w:rPr>
+          <w:color w:val="1a1c1e"/>
+          <w:sz w:val="24"/>
+          <w:szCs w:val="24"/>
+        </w:rPr>
+      </w:pPr>
+      <w:r>
+        <w:rPr>
+          <w:color w:val="1a1c1e"/>
+          <w:sz w:val="24"/>
+          <w:szCs w:val="24"/>
+          <w:rtl w:val="0"/>
+        </w:rPr>
+        <w:t xml:space="preserve">{#garantia_laboral_total_au_au}</w:t>
+      </w:r>
+      <w:r>
+        <w:rPr>
+          <w:b w:val="1"/>
+          <w:bCs w:val="1"/>
+          <w:color w:val="1a1c1e"/>
+          <w:sz w:val="24"/>
+          <w:szCs w:val="24"/>
+          <w:rtl w:val="0"/>
+        </w:rPr>
+        <w:t xml:space="preserve">{numeral_garantias_laboral_au_au}: INSTRUIR </w:t>
+      </w:r>
+      <w:r>
+        <w:rPr>
+          <w:color w:val="1a1c1e"/>
+          <w:sz w:val="24"/>
+          <w:szCs w:val="24"/>
+          <w:rtl w:val="0"/>
+        </w:rPr>
+        <w:t xml:space="preserve">a la empresa adjudicada a constituir la Fianza Laboral equivalente al {porcentaje_garantia_laboral_au_au}% del costo de la mano de obra incluida en la estructura de costos de su oferta, el cual es de </w:t>
+      </w:r>
+      <w:r>
+        <w:rPr>
+          <w:color w:val="1a1c1e"/>
+          <w:sz w:val="24"/>
+          <w:szCs w:val="24"/>
+          <w:rtl w:val="0"/>
+        </w:rPr>
+        <w:t xml:space="preserve">{monto_garantia_laboral_bs_letra_au_au}</w:t>
+      </w:r>
+      <w:r>
+        <w:rPr>
+          <w:color w:val="1a1c1e"/>
+          <w:sz w:val="24"/>
+          <w:szCs w:val="24"/>
+          <w:rtl w:val="0"/>
+        </w:rPr>
+        <w:t xml:space="preserve"> Bolívares (Bs. </w:t>
+      </w:r>
+      <w:r>
+        <w:rPr>
+          <w:color w:val="1a1c1e"/>
+          <w:sz w:val="24"/>
+          <w:szCs w:val="24"/>
+          <w:rtl w:val="0"/>
+        </w:rPr>
+        <w:t xml:space="preserve">{monto_garantia_laboral_bs_au_au})</w:t>
+      </w:r>
+      <w:r>
+        <w:rPr>
+          <w:color w:val="1a1c1e"/>
+          <w:sz w:val="24"/>
+          <w:szCs w:val="24"/>
+          <w:rtl w:val="0"/>
+        </w:rPr>
+        <w:t xml:space="preserve">, de conformidad con el artículo 124 de la Ley de Contrataciones Públicas. Dispone de un plazo máximo de cinco (05) días hábiles, contados a partir de la notificación, para consignar dichas garantías ante la Oficina de Consultoría Jurídica. {/garantia_laboral_total_au_au}</w:t>
+      </w:r>
+    </w:p>
+    <w:p>
+      <w:pPr>
+        <w:shd w:fill="ffffff" w:val="clear"/>
+        <w:spacing w:line="360" w:lineRule="auto"/>
+        <w:jc w:val="both"/>
+        <w:rPr>
+          <w:color w:val="1a1c1e"/>
+          <w:sz w:val="24"/>
+          <w:szCs w:val="24"/>
+        </w:rPr>
+      </w:pPr>
+      <w:r>
+        <w:rPr>
+          <w:color w:val="1a1c1e"/>
+          <w:sz w:val="24"/>
+          <w:szCs w:val="24"/>
+          <w:rtl w:val="0"/>
+        </w:rPr>
+        <w:t xml:space="preserve">{#garantia_laboral_parcial_au_au}</w:t>
+      </w:r>
+      <w:r>
+        <w:rPr>
+          <w:b w:val="1"/>
+          <w:bCs w:val="1"/>
+          <w:color w:val="1a1c1e"/>
+          <w:sz w:val="24"/>
+          <w:szCs w:val="24"/>
+          <w:rtl w:val="0"/>
+        </w:rPr>
+        <w:t xml:space="preserve">{numeral_garantias_laboral_au_au}: INSTRUIR </w:t>
+      </w:r>
+      <w:r>
+        <w:rPr>
+          <w:color w:val="1a1c1e"/>
+          <w:sz w:val="24"/>
+          <w:szCs w:val="24"/>
+          <w:rtl w:val="0"/>
+        </w:rPr>
+        <w:t xml:space="preserve">a las empresas adjudicadas a constituir la Fianza Laboral: </w:t>
+      </w:r>
+    </w:p>
+    <w:p>
+      <w:pPr>
+        <w:shd w:fill="ffffff" w:val="clear"/>
+        <w:spacing w:line="360" w:lineRule="auto"/>
+        <w:jc w:val="both"/>
+        <w:rPr>
+          <w:color w:val="1a1c1e"/>
+          <w:sz w:val="24"/>
+          <w:szCs w:val="24"/>
+        </w:rPr>
+      </w:pPr>
+      <w:r>
+        <w:rPr>
+          <w:color w:val="1a1c1e"/>
+          <w:sz w:val="24"/>
+          <w:szCs w:val="24"/>
+          <w:rtl w:val="0"/>
+        </w:rPr>
+        <w:t xml:space="preserve">{#monto_garantia_laboral_parcial_au_au} - </w:t>
+      </w:r>
+      <w:r>
+        <w:rPr>
+          <w:b w:val="1"/>
+          <w:bCs w:val="1"/>
+          <w:sz w:val="24"/>
+          <w:szCs w:val="24"/>
+          <w:rtl w:val="0"/>
+        </w:rPr>
+        <w:t xml:space="preserve">{oferente_adjudicado_au_au},  RIF {rif_oferente_adjudicado_au_au}: </w:t>
+      </w:r>
+      <w:r>
+        <w:rPr>
+          <w:sz w:val="24"/>
+          <w:szCs w:val="24"/>
+          <w:rtl w:val="0"/>
+        </w:rPr>
+        <w:t xml:space="preserve">fianza</w:t>
+      </w:r>
+      <w:r>
+        <w:rPr>
+          <w:b w:val="1"/>
+          <w:bCs w:val="1"/>
+          <w:sz w:val="24"/>
+          <w:szCs w:val="24"/>
+          <w:rtl w:val="0"/>
+        </w:rPr>
+        <w:t xml:space="preserve"> </w:t>
+      </w:r>
+      <w:r>
+        <w:rPr>
+          <w:color w:val="1a1c1e"/>
+          <w:sz w:val="24"/>
+          <w:szCs w:val="24"/>
+          <w:rtl w:val="0"/>
+        </w:rPr>
+        <w:t xml:space="preserve">equivalente al {porcentaje_garantia_laboral_au_au}% del costo de la mano de obra incluida en la estructura de costos de su oferta, el cual es de </w:t>
+      </w:r>
+      <w:r>
+        <w:rPr>
+          <w:color w:val="1a1c1e"/>
+          <w:sz w:val="24"/>
+          <w:szCs w:val="24"/>
+          <w:rtl w:val="0"/>
+        </w:rPr>
+        <w:t xml:space="preserve">{monto_garantia_laboral_bs_letra_au_au}</w:t>
+      </w:r>
+      <w:r>
+        <w:rPr>
+          <w:color w:val="1a1c1e"/>
+          <w:sz w:val="24"/>
+          <w:szCs w:val="24"/>
+          <w:rtl w:val="0"/>
+        </w:rPr>
+        <w:t xml:space="preserve"> Bolívares (Bs. </w:t>
+      </w:r>
+      <w:r>
+        <w:rPr>
+          <w:color w:val="1a1c1e"/>
+          <w:sz w:val="24"/>
+          <w:szCs w:val="24"/>
+          <w:rtl w:val="0"/>
+        </w:rPr>
+        <w:t xml:space="preserve">{monto_garantia_laboral_bs_au_au})</w:t>
+      </w:r>
+      <w:r>
+        <w:rPr>
+          <w:color w:val="1a1c1e"/>
+          <w:sz w:val="24"/>
+          <w:szCs w:val="24"/>
+          <w:rtl w:val="0"/>
+        </w:rPr>
+        <w:t xml:space="preserve">, de conformidad con el artículo 124 de la Ley de Contrataciones Públicas. Dispone de un plazo máximo de cinco (05) días hábiles, contados a partir de la notificación, para consignar dichas garantías ante la Oficina de Consultoría Jurídica.{/monto_garantia_laboral_parcial_au_au}</w:t>
+      </w:r>
+    </w:p>
+    <w:p>
+      <w:pPr>
+        <w:shd w:fill="ffffff" w:val="clear"/>
+        <w:spacing w:line="360" w:lineRule="auto"/>
+        <w:jc w:val="both"/>
+        <w:rPr>
+          <w:color w:val="1a1c1e"/>
+          <w:sz w:val="24"/>
+          <w:szCs w:val="24"/>
+        </w:rPr>
+      </w:pPr>
+      <w:r>
+        <w:rPr>
+          <w:color w:val="1a1c1e"/>
+          <w:sz w:val="24"/>
+          <w:szCs w:val="24"/>
+          <w:rtl w:val="0"/>
+        </w:rPr>
+        <w:t xml:space="preserve">{/garantia_laboral_parcial_au_au}</w:t>
+      </w:r>
+    </w:p>
+    <w:p>
+      <w:pPr>
+        <w:shd w:fill="ffffff" w:val="clear"/>
+        <w:spacing w:line="360" w:lineRule="auto"/>
+        <w:jc w:val="both"/>
+        <w:rPr>
+          <w:color w:val="1a1c1e"/>
+          <w:sz w:val="24"/>
+          <w:szCs w:val="24"/>
+        </w:rPr>
+      </w:pPr>
+      <w:r>
+        <w:rPr>
+          <w:color w:val="1a1c1e"/>
+          <w:sz w:val="24"/>
+          <w:szCs w:val="24"/>
+          <w:rtl w:val="0"/>
+        </w:rPr>
+        <w:t xml:space="preserve">{#retencion_garantia_laboral_au_au}No obstante, en ejercicio de la facultad prevista en el artículo 124 de la referida Ley, la adjudicataria podrá autorizar al {nom_ente_contratante} a efectuar la retención del cinco por ciento (05%) sobre los pagos o valuaciones que se realicen, a fin de garantizar el cumplimiento integral de las obligaciones asumidas, cuyo monto acumulado será reintegrado al momento de la recepción definitiva del objeto contratado. {/retencion_garantia_laboral_au_au}</w:t>
+      </w:r>
+    </w:p>
+    <w:p>
+      <w:pPr>
+        <w:shd w:fill="ffffff" w:val="clear"/>
+        <w:spacing w:line="360" w:lineRule="auto"/>
+        <w:jc w:val="both"/>
+        <w:rPr>
+          <w:sz w:val="24"/>
+          <w:szCs w:val="24"/>
+        </w:rPr>
+      </w:pPr>
+      <w:r>
+        <w:rPr>
+          <w:color w:val="1a1c1e"/>
+          <w:sz w:val="24"/>
+          <w:szCs w:val="24"/>
+          <w:rtl w:val="0"/>
+        </w:rPr>
+        <w:t xml:space="preserve">{/requiere_garantia_laboral_au_au}</w:t>
+      </w:r>
+      <w:r>
+        <w:rPr>
+          <w:rtl w:val="0"/>
+        </w:rPr>
+      </w:r>
+    </w:p>
+    <w:p>
+      <w:pPr>
+        <w:shd w:fill="ffffff" w:val="clear"/>
+        <w:spacing w:after="0" w:before="0" w:line="276" w:lineRule="auto"/>
+        <w:jc w:val="both"/>
         <w:rPr>
           <w:color w:val="1a1c1e"/>
           <w:sz w:val="24"/>
           <w:szCs w:val="24"/>
           <w:highlight w:val="white"/>
-          <w:rtl w:val="0"/>
-        </w:rPr>
-        <w:t xml:space="preserve">En atención a lo anterior, y de conformidad con la Ley de Contrataciones Públicas, se les informa que disponen de un plazo máximo de cinco</w:t>
-      </w:r>
-      <w:r>
-        <w:rPr>
-          <w:b w:val="1"/>
-          <w:bCs w:val="1"/>
-          <w:color w:val="1a1c1e"/>
-          <w:sz w:val="24"/>
-          <w:szCs w:val="24"/>
-          <w:highlight w:val="white"/>
-          <w:rtl w:val="0"/>
-        </w:rPr>
-        <w:t xml:space="preserve"> (05) días hábiles</w:t>
-      </w:r>
-      <w:r>
-        <w:rPr>
-          <w:color w:val="1a1c1e"/>
-          <w:sz w:val="24"/>
-          <w:szCs w:val="24"/>
-          <w:highlight w:val="white"/>
-          <w:rtl w:val="0"/>
-        </w:rPr>
-        <w:t xml:space="preserve">, contados a partir de la recepción de la presente notificación, para enviar la Garantía</w:t>
-      </w:r>
-      <w:r>
-        <w:rPr>
-          <w:b w:val="1"/>
-          <w:bCs w:val="1"/>
-          <w:color w:val="1a1c1e"/>
-          <w:sz w:val="24"/>
-          <w:szCs w:val="24"/>
-          <w:highlight w:val="white"/>
-          <w:rtl w:val="0"/>
-        </w:rPr>
-        <w:t xml:space="preserve"> de Fiel Cumplimiento </w:t>
-      </w:r>
-      <w:r>
-        <w:rPr>
-          <w:color w:val="1a1c1e"/>
-          <w:sz w:val="24"/>
-          <w:szCs w:val="24"/>
-          <w:highlight w:val="white"/>
-          <w:rtl w:val="0"/>
-        </w:rPr>
-        <w:t xml:space="preserve">y</w:t>
-      </w:r>
-      <w:r>
-        <w:rPr>
-          <w:color w:val="1a1c1e"/>
-          <w:sz w:val="24"/>
-          <w:szCs w:val="24"/>
-          <w:highlight w:val="white"/>
-          <w:rtl w:val="0"/>
-        </w:rPr>
-        <w:t xml:space="preserve"> demás garantías exigidas en el Pliego de Condiciones, como requisito indispensable para proceder a la suscripción del contrato respectivo.</w:t>
-      </w:r>
-      <w:r>
-        <w:rPr>
-          <w:rtl w:val="0"/>
-        </w:rPr>
-      </w:r>
-    </w:p>
-    <w:p>
-      <w:pPr>
-        <w:shd w:fill="ffffff" w:val="clear"/>
-        <w:spacing w:after="280" w:before="220" w:line="342.85714285714283" w:lineRule="auto"/>
-        <w:jc w:val="both"/>
-        <w:rPr>
-          <w:color w:val="1a1c1e"/>
-          <w:sz w:val="24"/>
-          <w:szCs w:val="24"/>
-        </w:rPr>
-      </w:pPr>
-      <w:r>
-        <w:rPr>
-          <w:color w:val="1a1c1e"/>
-          <w:sz w:val="24"/>
-          <w:szCs w:val="24"/>
-          <w:highlight w:val="white"/>
-          <w:rtl w:val="0"/>
-        </w:rPr>
-        <w:t xml:space="preserve">De conformidad con lo establecido en la Ley Orgánica de Procedimientos Administrativos (LOPA), contra el Acto Administrativo de Adjudicación que se notifica, los interesados ​​podrán interponer el Recurso</w:t>
-      </w:r>
-      <w:r>
-        <w:rPr>
-          <w:b w:val="1"/>
-          <w:bCs w:val="1"/>
-          <w:color w:val="1a1c1e"/>
-          <w:sz w:val="24"/>
-          <w:szCs w:val="24"/>
-          <w:highlight w:val="white"/>
-          <w:rtl w:val="0"/>
-        </w:rPr>
-        <w:t xml:space="preserve"> de reconsideración ante</w:t>
-      </w:r>
-      <w:r>
-        <w:rPr>
-          <w:color w:val="1a1c1e"/>
-          <w:sz w:val="24"/>
-          <w:szCs w:val="24"/>
-          <w:highlight w:val="white"/>
-          <w:rtl w:val="0"/>
-        </w:rPr>
-        <w:t xml:space="preserve"> la Máxima Autoridad de este ente, dentro de los quince (15) días hábiles siguientes a la presente notificación. Asimismo, podrán acudir directamente a la vía judicial interponiendo el Recurso</w:t>
-      </w:r>
-      <w:r>
-        <w:rPr>
-          <w:b w:val="1"/>
-          <w:bCs w:val="1"/>
-          <w:color w:val="1a1c1e"/>
-          <w:sz w:val="24"/>
-          <w:szCs w:val="24"/>
-          <w:highlight w:val="white"/>
-          <w:rtl w:val="0"/>
-        </w:rPr>
-        <w:t xml:space="preserve"> Contencioso Administrativo de </w:t>
-      </w:r>
-      <w:r>
-        <w:rPr>
-          <w:b w:val="1"/>
-          <w:bCs w:val="1"/>
-          <w:color w:val="1a1c1e"/>
-          <w:sz w:val="24"/>
-          <w:szCs w:val="24"/>
-          <w:highlight w:val="white"/>
-          <w:rtl w:val="0"/>
-        </w:rPr>
-        <w:t xml:space="preserve">Nulidad </w:t>
-      </w:r>
-      <w:r>
-        <w:rPr>
-          <w:color w:val="1a1c1e"/>
-          <w:sz w:val="24"/>
-          <w:szCs w:val="24"/>
-          <w:highlight w:val="white"/>
-          <w:rtl w:val="0"/>
-        </w:rPr>
-        <w:t xml:space="preserve">ante</w:t>
-      </w:r>
-      <w:r>
-        <w:rPr>
-          <w:color w:val="1a1c1e"/>
-          <w:sz w:val="24"/>
-          <w:szCs w:val="24"/>
-          <w:highlight w:val="white"/>
-          <w:rtl w:val="0"/>
-        </w:rPr>
-        <w:t xml:space="preserve"> los órganos de la Jurisdicción Contencioso-Administrativa, dentro de los plazos establecidos en la ley que rige la materia.</w:t>
-      </w:r>
-      <w:r>
-        <w:rPr>
-          <w:rtl w:val="0"/>
-        </w:rPr>
-      </w:r>
-    </w:p>
-    <w:p>
-      <w:pPr>
-        <w:shd w:fill="ffffff" w:val="clear"/>
-        <w:spacing w:after="280" w:before="220" w:line="342.85714285714283" w:lineRule="auto"/>
+        </w:rPr>
+      </w:pPr>
+      <w:r>
+        <w:rPr>
+          <w:rtl w:val="0"/>
+        </w:rPr>
+      </w:r>
+    </w:p>
+    <w:p>
+      <w:pPr>
+        <w:shd w:fill="ffffff" w:val="clear"/>
+        <w:spacing w:after="0" w:before="0" w:line="360" w:lineRule="auto"/>
+        <w:jc w:val="both"/>
+        <w:rPr>
+          <w:color w:val="1a1c1e"/>
+          <w:sz w:val="24"/>
+          <w:szCs w:val="24"/>
+        </w:rPr>
+      </w:pPr>
+      <w:r>
+        <w:rPr>
+          <w:color w:val="1a1c1e"/>
+          <w:sz w:val="24"/>
+          <w:szCs w:val="24"/>
+          <w:rtl w:val="0"/>
+        </w:rPr>
+        <w:t xml:space="preserve">En otro orden de ideas, se le notifica que contra el presente acto administrativo, el interesado en caso de considerar afectados sus derechos e intereses, podrá ejercer el respectivo Recurso de Reconsideración ante la misma autoridad que lo dictó, dentro de los quince (15) días hábiles siguientes a su notificación, o ejercer directamente el Recurso Contencioso Administrativo de Nulidad ante los Órganos de la Jurisdicción Contencioso-Administrativa competentes, dentro de los ciento ochenta (180) días continuos siguientes.</w:t>
+      </w:r>
+    </w:p>
+    <w:p>
+      <w:pPr>
+        <w:shd w:fill="ffffff" w:val="clear"/>
+        <w:spacing w:after="0" w:before="220" w:line="276" w:lineRule="auto"/>
         <w:jc w:val="both"/>
         <w:rPr>
           <w:color w:val="1a1c1e"/>
@@ -913,12 +2141,72 @@
       </w:r>
     </w:p>
     <w:sectPr>
+      <w:headerReference r:id="rId6" w:type="default"/>
       <w:pgSz w:h="16834" w:w="11909" w:orient="portrait"/>
-      <w:pgMar w:bottom="1440" w:top="1440" w:left="1440" w:right="1440" w:header="720" w:footer="720"/>
+      <w:pgMar w:bottom="1440.0000000000002" w:top="1440.0000000000002" w:left="1440.0000000000002" w:right="1440.0000000000002" w:header="283.46456692913387" w:footer="720"/>
       <w:pgNumType w:start="1"/>
     </w:sectPr>
   </w:body>
 </w:document>
+</file>
+
+<file path=word/header1.xml><?xml version="1.0" encoding="utf-8"?>
+<w:hdr xmlns:mc="http://schemas.openxmlformats.org/markup-compatibility/2006" xmlns:o="urn:schemas-microsoft-com:office:office" xmlns:r="http://schemas.openxmlformats.org/officeDocument/2006/relationships" xmlns:m="http://schemas.openxmlformats.org/officeDocument/2006/math" xmlns:v="urn:schemas-microsoft-com:vml" xmlns:wp="http://schemas.openxmlformats.org/drawingml/2006/wordprocessingDrawing" xmlns:w10="urn:schemas-microsoft-com:office:word" xmlns:w="http://schemas.openxmlformats.org/wordprocessingml/2006/main" xmlns:wne="http://schemas.microsoft.com/office/word/2006/wordml" xmlns:sl="http://schemas.openxmlformats.org/schemaLibrary/2006/main" xmlns:a="http://schemas.openxmlformats.org/drawingml/2006/main" xmlns:pic="http://schemas.openxmlformats.org/drawingml/2006/picture" xmlns:c="http://schemas.openxmlformats.org/drawingml/2006/chart" xmlns:lc="http://schemas.openxmlformats.org/drawingml/2006/lockedCanvas" xmlns:dgm="http://schemas.openxmlformats.org/drawingml/2006/diagram" xmlns:wps="http://schemas.microsoft.com/office/word/2010/wordprocessingShape" xmlns:wpg="http://schemas.microsoft.com/office/word/2010/wordprocessingGroup" xmlns:w14="http://schemas.microsoft.com/office/word/2010/wordml" xmlns:w15="http://schemas.microsoft.com/office/word/2012/wordml" xmlns:w16="http://schemas.microsoft.com/office/word/2018/wordml" xmlns:w16cex="http://schemas.microsoft.com/office/word/2018/wordml/cex" xmlns:w16cid="http://schemas.microsoft.com/office/word/2016/wordml/cid" xmlns="http://schemas.microsoft.com/office/tasks/2019/documenttasks" xmlns:cr="http://schemas.microsoft.com/office/comments/2020/reactions">
+  <w:p>
+    <w:pPr>
+      <w:shd w:fill="ffffff" w:val="clear"/>
+      <w:spacing w:before="220" w:line="342.85714285714283" w:lineRule="auto"/>
+      <w:jc w:val="center"/>
+      <w:rPr>
+        <w:color w:val="1a1c1e"/>
+        <w:sz w:val="24"/>
+        <w:szCs w:val="24"/>
+      </w:rPr>
+    </w:pPr>
+    <w:r>
+      <w:rPr>
+        <w:b w:val="1"/>
+        <w:bCs w:val="1"/>
+        <w:color w:val="1a1c1e"/>
+        <w:sz w:val="24"/>
+        <w:szCs w:val="24"/>
+        <w:rtl w:val="0"/>
+      </w:rPr>
+      <w:t xml:space="preserve">REPÚBLICA BOLIVARIANA DE VENEZUELA</w:t>
+      <w:br w:type="textWrapping"/>
+      <w:t xml:space="preserve">{nom_ente_contratante}</w:t>
+    </w:r>
+    <w:r>
+      <w:rPr>
+        <w:rtl w:val="0"/>
+      </w:rPr>
+    </w:r>
+  </w:p>
+  <w:p>
+    <w:pPr>
+      <w:shd w:fill="ffffff" w:val="clear"/>
+      <w:spacing w:after="200" w:line="360" w:lineRule="auto"/>
+      <w:jc w:val="center"/>
+      <w:rPr/>
+    </w:pPr>
+    <w:r>
+      <w:rPr>
+        <w:b w:val="1"/>
+        <w:bCs w:val="1"/>
+        <w:color w:val="1a1c1e"/>
+        <w:sz w:val="24"/>
+        <w:szCs w:val="24"/>
+        <w:rtl w:val="0"/>
+      </w:rPr>
+      <w:t xml:space="preserve">COMISIÓN DE CONTRATACIONES PÚBLICAS</w:t>
+    </w:r>
+    <w:r>
+      <w:rPr>
+        <w:rtl w:val="0"/>
+      </w:rPr>
+    </w:r>
+  </w:p>
+</w:hdr>
 </file>
 
 <file path=word/numbering.xml><?xml version="1.0" encoding="utf-8"?>

</xml_diff>